<commit_message>
content(workspace): add TXT and DOCX exports for notes and materials
Publish teaching files in md + txt + docx so content is easy to review
in Word and plain text, not Markdown alone. Add export_md_formats.py.

Co-authored-by: professorbhakta <professorbhakta@users.noreply.github.com>
</commit_message>
<xml_diff>
--- a/materials/assignments/unit-01-assignments.docx
+++ b/materials/assignments/unit-01-assignments.docx
@@ -4,20 +4,45 @@
   <w:body>
     <w:p>
       <w:pPr>
-        <w:pStyle w:val="Title"/>
+        <w:pStyle w:val="Heading1"/>
       </w:pPr>
       <w:r>
         <w:t>Computer Information — Unit 1 Assignments</w:t>
       </w:r>
     </w:p>
     <w:p>
+      <w:r/>
       <w:r>
-        <w:t>**Parul University** · BA-LLB · **Computer Information** · **Prof. Shivam Bhakta**</w:t>
+        <w:rPr>
+          <w:b/>
+        </w:rPr>
+        <w:t>Parul University</w:t>
+      </w:r>
+      <w:r>
+        <w:t xml:space="preserve"> · BA-LLB · </w:t>
+      </w:r>
+      <w:r>
+        <w:rPr>
+          <w:b/>
+        </w:rPr>
+        <w:t>Computer Information</w:t>
+      </w:r>
+      <w:r>
+        <w:t xml:space="preserve"> · </w:t>
+      </w:r>
+      <w:r>
+        <w:rPr>
+          <w:b/>
+        </w:rPr>
+        <w:t>Prof. Shivam Bhakta</w:t>
+      </w:r>
+      <w:r>
+        <w:t xml:space="preserve">  </w:t>
       </w:r>
     </w:p>
     <w:p>
       <w:r>
-        <w:t>Aligned to Unit-1: Introduction to Basic Computing</w:t>
+        <w:t xml:space="preserve">Aligned to Unit-1: Introduction to Basic Computing  </w:t>
       </w:r>
     </w:p>
     <w:p>
@@ -26,26 +51,45 @@
       </w:r>
     </w:p>
     <w:p>
+      <w:r>
+        <w:t>---</w:t>
+      </w:r>
+    </w:p>
+    <w:p>
       <w:pPr>
-        <w:pStyle w:val="Heading1"/>
+        <w:pStyle w:val="Heading2"/>
       </w:pPr>
       <w:r>
         <w:t>Assignment 1 — Digital Chambers Starter Kit (Individual)</w:t>
       </w:r>
     </w:p>
     <w:p>
+      <w:r/>
       <w:r>
-        <w:t>**Marks suggestion:** 10</w:t>
+        <w:rPr>
+          <w:b/>
+        </w:rPr>
+        <w:t>Marks suggestion:</w:t>
+      </w:r>
+      <w:r>
+        <w:t xml:space="preserve"> 10  </w:t>
       </w:r>
     </w:p>
     <w:p>
+      <w:r/>
       <w:r>
-        <w:t>**Submission:** PDF or DOCX</w:t>
+        <w:rPr>
+          <w:b/>
+        </w:rPr>
+        <w:t>Submission:</w:t>
+      </w:r>
+      <w:r>
+        <w:t xml:space="preserve"> PDF or DOCX  </w:t>
       </w:r>
     </w:p>
     <w:p>
       <w:pPr>
-        <w:pStyle w:val="Heading2"/>
+        <w:pStyle w:val="Heading3"/>
       </w:pPr>
       <w:r>
         <w:t>Task</w:t>
@@ -58,39 +102,39 @@
     </w:p>
     <w:p>
       <w:pPr>
-        <w:pStyle w:val="ListNumber"/>
+        <w:pStyle w:val="ListBullet"/>
       </w:pPr>
       <w:r>
-        <w:t>Folder structure for one client matter (at least 5 folders).</w:t>
+        <w:t xml:space="preserve">Folder structure for one client matter (at least 5 folders).  </w:t>
       </w:r>
     </w:p>
     <w:p>
       <w:pPr>
-        <w:pStyle w:val="ListNumber"/>
+        <w:pStyle w:val="ListBullet"/>
       </w:pPr>
       <w:r>
-        <w:t>File-naming rules (with 3 good examples and 3 bad examples).</w:t>
+        <w:t xml:space="preserve">File-naming rules (with 3 good examples and 3 bad examples).  </w:t>
       </w:r>
     </w:p>
     <w:p>
       <w:pPr>
-        <w:pStyle w:val="ListNumber"/>
+        <w:pStyle w:val="ListBullet"/>
       </w:pPr>
       <w:r>
-        <w:t>Daily backup rule (what + when + where).</w:t>
+        <w:t xml:space="preserve">Daily backup rule (what + when + where).  </w:t>
       </w:r>
     </w:p>
     <w:p>
       <w:pPr>
-        <w:pStyle w:val="ListNumber"/>
+        <w:pStyle w:val="ListBullet"/>
       </w:pPr>
       <w:r>
-        <w:t>Screen-lock / password hygiene rules.</w:t>
+        <w:t xml:space="preserve">Screen-lock / password hygiene rules.  </w:t>
       </w:r>
     </w:p>
     <w:p>
       <w:pPr>
-        <w:pStyle w:val="ListNumber"/>
+        <w:pStyle w:val="ListBullet"/>
       </w:pPr>
       <w:r>
         <w:t>One paragraph on why these habits protect client confidentiality.</w:t>
@@ -98,7 +142,7 @@
     </w:p>
     <w:p>
       <w:pPr>
-        <w:pStyle w:val="Heading2"/>
+        <w:pStyle w:val="Heading3"/>
       </w:pPr>
       <w:r>
         <w:t>Evaluation focus</w:t>
@@ -110,21 +154,33 @@
       </w:r>
     </w:p>
     <w:p>
+      <w:r>
+        <w:t>---</w:t>
+      </w:r>
+    </w:p>
+    <w:p>
       <w:pPr>
-        <w:pStyle w:val="Heading1"/>
+        <w:pStyle w:val="Heading2"/>
       </w:pPr>
       <w:r>
         <w:t>Assignment 2 — Internet Research Mini Lab (Individual)</w:t>
       </w:r>
     </w:p>
     <w:p>
+      <w:r/>
       <w:r>
-        <w:t>**Marks suggestion:** 10</w:t>
+        <w:rPr>
+          <w:b/>
+        </w:rPr>
+        <w:t>Marks suggestion:</w:t>
+      </w:r>
+      <w:r>
+        <w:t xml:space="preserve"> 10  </w:t>
       </w:r>
     </w:p>
     <w:p>
       <w:pPr>
-        <w:pStyle w:val="Heading2"/>
+        <w:pStyle w:val="Heading3"/>
       </w:pPr>
       <w:r>
         <w:t>Task</w:t>
@@ -137,31 +193,31 @@
     </w:p>
     <w:p>
       <w:pPr>
-        <w:pStyle w:val="ListNumber"/>
+        <w:pStyle w:val="ListBullet"/>
       </w:pPr>
       <w:r>
-        <w:t>Find the official webpage of any one Indian court (Supreme Court / any High Court).</w:t>
+        <w:t xml:space="preserve">Find the official webpage of any one Indian court (Supreme Court / any High Court).  </w:t>
       </w:r>
     </w:p>
     <w:p>
       <w:pPr>
-        <w:pStyle w:val="ListNumber"/>
+        <w:pStyle w:val="ListBullet"/>
       </w:pPr>
       <w:r>
-        <w:t>Note the URL and what information is available (cause list / judgments / circulars).</w:t>
+        <w:t xml:space="preserve">Note the URL and what information is available (cause list / judgments / circulars).  </w:t>
       </w:r>
     </w:p>
     <w:p>
       <w:pPr>
-        <w:pStyle w:val="ListNumber"/>
+        <w:pStyle w:val="ListBullet"/>
       </w:pPr>
       <w:r>
-        <w:t>Write 150–200 words on how a BA-LLB student should evaluate whether an online legal source is reliable.</w:t>
+        <w:t xml:space="preserve">Write 150–200 words on how a BA-LLB student should evaluate whether an online legal source is reliable.  </w:t>
       </w:r>
     </w:p>
     <w:p>
       <w:pPr>
-        <w:pStyle w:val="ListNumber"/>
+        <w:pStyle w:val="ListBullet"/>
       </w:pPr>
       <w:r>
         <w:t>Attach screenshots (optional) with date of access.</w:t>
@@ -169,7 +225,7 @@
     </w:p>
     <w:p>
       <w:pPr>
-        <w:pStyle w:val="Heading2"/>
+        <w:pStyle w:val="Heading3"/>
       </w:pPr>
       <w:r>
         <w:t>Caution</w:t>
@@ -181,21 +237,33 @@
       </w:r>
     </w:p>
     <w:p>
+      <w:r>
+        <w:t>---</w:t>
+      </w:r>
+    </w:p>
+    <w:p>
       <w:pPr>
-        <w:pStyle w:val="Heading1"/>
+        <w:pStyle w:val="Heading2"/>
       </w:pPr>
       <w:r>
         <w:t>Assignment 3 — Digital Communication Role-Play (Pair Work)</w:t>
       </w:r>
     </w:p>
     <w:p>
+      <w:r/>
       <w:r>
-        <w:t>**Marks suggestion:** 10</w:t>
+        <w:rPr>
+          <w:b/>
+        </w:rPr>
+        <w:t>Marks suggestion:</w:t>
+      </w:r>
+      <w:r>
+        <w:t xml:space="preserve"> 10  </w:t>
       </w:r>
     </w:p>
     <w:p>
       <w:pPr>
-        <w:pStyle w:val="Heading2"/>
+        <w:pStyle w:val="Heading3"/>
       </w:pPr>
       <w:r>
         <w:t>Scenario</w:t>
@@ -208,7 +276,7 @@
     </w:p>
     <w:p>
       <w:pPr>
-        <w:pStyle w:val="Heading2"/>
+        <w:pStyle w:val="Heading3"/>
       </w:pPr>
       <w:r>
         <w:t>Task</w:t>
@@ -216,23 +284,41 @@
     </w:p>
     <w:p>
       <w:pPr>
-        <w:pStyle w:val="ListNumber"/>
+        <w:pStyle w:val="ListBullet"/>
       </w:pPr>
       <w:r>
-        <w:t>Student A writes an **unprofessional** reply (what not to do).</w:t>
+        <w:t xml:space="preserve">Student A writes an </w:t>
+      </w:r>
+      <w:r>
+        <w:rPr>
+          <w:b/>
+        </w:rPr>
+        <w:t>unprofessional</w:t>
+      </w:r>
+      <w:r>
+        <w:t xml:space="preserve"> reply (what not to do).  </w:t>
       </w:r>
     </w:p>
     <w:p>
       <w:pPr>
-        <w:pStyle w:val="ListNumber"/>
+        <w:pStyle w:val="ListBullet"/>
       </w:pPr>
       <w:r>
-        <w:t>Student B writes a **professional** reply (tone, caution, next steps, no overpromise).</w:t>
+        <w:t xml:space="preserve">Student B writes a </w:t>
+      </w:r>
+      <w:r>
+        <w:rPr>
+          <w:b/>
+        </w:rPr>
+        <w:t>professional</w:t>
+      </w:r>
+      <w:r>
+        <w:t xml:space="preserve"> reply (tone, caution, next steps, no overpromise).  </w:t>
       </w:r>
     </w:p>
     <w:p>
       <w:pPr>
-        <w:pStyle w:val="ListNumber"/>
+        <w:pStyle w:val="ListBullet"/>
       </w:pPr>
       <w:r>
         <w:t>Together, submit a 1-page reflection:</w:t>
@@ -240,12 +326,12 @@
     </w:p>
     <w:p>
       <w:r>
-        <w:t xml:space="preserve">   - Risks of casual legal promises on chat</w:t>
+        <w:t xml:space="preserve">   - Risks of casual legal promises on chat  </w:t>
       </w:r>
     </w:p>
     <w:p>
       <w:r>
-        <w:t xml:space="preserve">   - When to shift from WhatsApp to email</w:t>
+        <w:t xml:space="preserve">   - When to shift from WhatsApp to email  </w:t>
       </w:r>
     </w:p>
     <w:p>
@@ -254,16 +340,8 @@
       </w:r>
     </w:p>
     <w:p>
-      <w:pPr>
-        <w:pStyle w:val="Heading1"/>
-      </w:pPr>
       <w:r>
-        <w:t>Assignment 4 — AI Assisted, Human Verified (Individual)</w:t>
-      </w:r>
-    </w:p>
-    <w:p>
-      <w:r>
-        <w:t>**Marks suggestion:** 15</w:t>
+        <w:t>---</w:t>
       </w:r>
     </w:p>
     <w:p>
@@ -271,44 +349,64 @@
         <w:pStyle w:val="Heading2"/>
       </w:pPr>
       <w:r>
+        <w:t>Assignment 4 — AI Assisted, Human Verified (Individual)</w:t>
+      </w:r>
+    </w:p>
+    <w:p>
+      <w:r/>
+      <w:r>
+        <w:rPr>
+          <w:b/>
+        </w:rPr>
+        <w:t>Marks suggestion:</w:t>
+      </w:r>
+      <w:r>
+        <w:t xml:space="preserve"> 15  </w:t>
+      </w:r>
+    </w:p>
+    <w:p>
+      <w:pPr>
+        <w:pStyle w:val="Heading3"/>
+      </w:pPr>
+      <w:r>
         <w:t>Task</w:t>
       </w:r>
     </w:p>
     <w:p>
       <w:pPr>
-        <w:pStyle w:val="ListNumber"/>
+        <w:pStyle w:val="ListBullet"/>
       </w:pPr>
       <w:r>
-        <w:t>Choose any one Unit-1 topic (e.g., OS / Internet / AI in law).</w:t>
+        <w:t xml:space="preserve">Choose any one Unit-1 topic (e.g., OS / Internet / AI in law).  </w:t>
       </w:r>
     </w:p>
     <w:p>
       <w:pPr>
-        <w:pStyle w:val="ListNumber"/>
+        <w:pStyle w:val="ListBullet"/>
       </w:pPr>
       <w:r>
-        <w:t>Ask any AI tool to generate a 150-word explanation.</w:t>
+        <w:t xml:space="preserve">Ask any AI tool to generate a 150-word explanation.  </w:t>
       </w:r>
     </w:p>
     <w:p>
       <w:pPr>
-        <w:pStyle w:val="ListNumber"/>
+        <w:pStyle w:val="ListBullet"/>
       </w:pPr>
       <w:r>
-        <w:t>Paste the AI output.</w:t>
+        <w:t xml:space="preserve">Paste the AI output.  </w:t>
       </w:r>
     </w:p>
     <w:p>
       <w:pPr>
-        <w:pStyle w:val="ListNumber"/>
+        <w:pStyle w:val="ListBullet"/>
       </w:pPr>
       <w:r>
-        <w:t>Rewrite a corrected student version.</w:t>
+        <w:t xml:space="preserve">Rewrite a corrected student version.  </w:t>
       </w:r>
     </w:p>
     <w:p>
       <w:pPr>
-        <w:pStyle w:val="ListNumber"/>
+        <w:pStyle w:val="ListBullet"/>
       </w:pPr>
       <w:r>
         <w:t>Add a table:</w:t>
@@ -316,22 +414,17 @@
     </w:p>
     <w:p>
       <w:r>
-        <w:t>| AI Claim / Sentence | Verified? (Yes/No/Partial) | Your Correction / Comment |</w:t>
+        <w:t>AI Claim / Sentence | Verified? (Yes/No/Partial) | Your Correction / Comment</w:t>
       </w:r>
     </w:p>
     <w:p>
       <w:r>
-        <w:t>|---|---|---|</w:t>
-      </w:r>
-    </w:p>
-    <w:p>
-      <w:r>
-        <w:t>|  |  |  |</w:t>
+        <w:t xml:space="preserve"> |  | </w:t>
       </w:r>
     </w:p>
     <w:p>
       <w:pPr>
-        <w:pStyle w:val="ListNumber"/>
+        <w:pStyle w:val="ListBullet"/>
       </w:pPr>
       <w:r>
         <w:t>Final reflection (100 words): benefits + risks (hallucination, bias, confidentiality).</w:t>
@@ -339,7 +432,7 @@
     </w:p>
     <w:p>
       <w:pPr>
-        <w:pStyle w:val="Heading2"/>
+        <w:pStyle w:val="Heading3"/>
       </w:pPr>
       <w:r>
         <w:t>Learning outcome</w:t>
@@ -351,27 +444,44 @@
       </w:r>
     </w:p>
     <w:p>
+      <w:r>
+        <w:t>---</w:t>
+      </w:r>
+    </w:p>
+    <w:p>
       <w:pPr>
-        <w:pStyle w:val="Heading1"/>
+        <w:pStyle w:val="Heading2"/>
       </w:pPr>
       <w:r>
         <w:t>Assignment 5 — Oral Presentation Seed (Optional for Seminar/CIA)</w:t>
       </w:r>
     </w:p>
     <w:p>
+      <w:r/>
       <w:r>
-        <w:t>**Marks suggestion:** 10</w:t>
+        <w:rPr>
+          <w:b/>
+        </w:rPr>
+        <w:t>Marks suggestion:</w:t>
+      </w:r>
+      <w:r>
+        <w:t xml:space="preserve"> 10  </w:t>
       </w:r>
     </w:p>
     <w:p>
       <w:r>
-        <w:t>Prepare a 3-minute talk:</w:t>
+        <w:t xml:space="preserve">Prepare a 3-minute talk:  </w:t>
       </w:r>
     </w:p>
     <w:p>
+      <w:r/>
       <w:r>
-        <w:t>**“What a first-year law student must know about computers before internship.”**</w:t>
+        <w:rPr>
+          <w:b/>
+        </w:rPr>
+        <w:t>“What a first-year law student must know about computers before internship.”</w:t>
       </w:r>
+      <w:r/>
     </w:p>
     <w:p>
       <w:r>
@@ -383,7 +493,7 @@
         <w:pStyle w:val="ListBullet"/>
       </w:pPr>
       <w:r>
-        <w:t>1 hardware example</w:t>
+        <w:t xml:space="preserve">1 hardware example  </w:t>
       </w:r>
     </w:p>
     <w:p>
@@ -391,7 +501,7 @@
         <w:pStyle w:val="ListBullet"/>
       </w:pPr>
       <w:r>
-        <w:t>1 OS/file habit</w:t>
+        <w:t xml:space="preserve">1 OS/file habit  </w:t>
       </w:r>
     </w:p>
     <w:p>
@@ -399,7 +509,7 @@
         <w:pStyle w:val="ListBullet"/>
       </w:pPr>
       <w:r>
-        <w:t>1 internet research caution</w:t>
+        <w:t xml:space="preserve">1 internet research caution  </w:t>
       </w:r>
     </w:p>
     <w:p>
@@ -407,17 +517,22 @@
         <w:pStyle w:val="ListBullet"/>
       </w:pPr>
       <w:r>
-        <w:t>1 AI caution</w:t>
+        <w:t xml:space="preserve">1 AI caution  </w:t>
       </w:r>
     </w:p>
     <w:p>
       <w:r>
-        <w:t>(Slides for this can later be developed on the `slides` branch.)</w:t>
+        <w:t>(Slides for this can later be developed on the slides branch.)</w:t>
+      </w:r>
+    </w:p>
+    <w:p>
+      <w:r>
+        <w:t>---</w:t>
       </w:r>
     </w:p>
     <w:p>
       <w:pPr>
-        <w:pStyle w:val="Heading1"/>
+        <w:pStyle w:val="Heading2"/>
       </w:pPr>
       <w:r>
         <w:t>Submission Checklist</w:t>
@@ -428,7 +543,7 @@
         <w:pStyle w:val="ListBullet"/>
       </w:pPr>
       <w:r>
-        <w:t>[ ] Name, enrolment no., semester on first page</w:t>
+        <w:t xml:space="preserve">[ ] Name, enrolment no., semester on first page  </w:t>
       </w:r>
     </w:p>
     <w:p>
@@ -436,7 +551,7 @@
         <w:pStyle w:val="ListBullet"/>
       </w:pPr>
       <w:r>
-        <w:t>[ ] Unit number and assignment number in title</w:t>
+        <w:t xml:space="preserve">[ ] Unit number and assignment number in title  </w:t>
       </w:r>
     </w:p>
     <w:p>
@@ -444,7 +559,7 @@
         <w:pStyle w:val="ListBullet"/>
       </w:pPr>
       <w:r>
-        <w:t>[ ] Original writing (no blind copy-paste)</w:t>
+        <w:t xml:space="preserve">[ ] Original writing (no blind copy-paste)  </w:t>
       </w:r>
     </w:p>
     <w:p>
@@ -452,7 +567,7 @@
         <w:pStyle w:val="ListBullet"/>
       </w:pPr>
       <w:r>
-        <w:t>[ ] If AI used, disclosure included as required by Assignment 4</w:t>
+        <w:t xml:space="preserve">[ ] If AI used, disclosure included as required by Assignment 4  </w:t>
       </w:r>
     </w:p>
     <w:p>
@@ -460,12 +575,17 @@
         <w:pStyle w:val="ListBullet"/>
       </w:pPr>
       <w:r>
-        <w:t>[ ] File named: `RollNo_Unit1_AssignmentNo_Name.docx`</w:t>
+        <w:t>[ ] File named: RollNo_Unit1_AssignmentNo_Name.docx</w:t>
       </w:r>
     </w:p>
     <w:p>
       <w:r>
-        <w:t>*Prof. Shivam Bhakta · Parul University · Computer Information*</w:t>
+        <w:t>---</w:t>
+      </w:r>
+    </w:p>
+    <w:p>
+      <w:r>
+        <w:t>Prof. Shivam Bhakta · Parul University · Computer Information</w:t>
       </w:r>
     </w:p>
     <w:sectPr>
@@ -841,6 +961,10 @@
     <w:name w:val="Normal"/>
     <w:qFormat/>
     <w:rsid w:val="00FC693F"/>
+    <w:rPr>
+      <w:rFonts w:ascii="Calibri" w:hAnsi="Calibri"/>
+      <w:sz w:val="22"/>
+    </w:rPr>
   </w:style>
   <w:style w:type="paragraph" w:styleId="Header">
     <w:name w:val="header"/>

</xml_diff>

<commit_message>
content(workspace): add complete Unit 1–5 packs (notes, materials, slides)
Split full-course content into dedicated unit folders for all five syllabus
units with md/txt/docx for notes and materials, plus per-unit PPTX decks.

Co-authored-by: professorbhakta <professorbhakta@users.noreply.github.com>
</commit_message>
<xml_diff>
--- a/materials/assignments/unit-01-assignments.docx
+++ b/materials/assignments/unit-01-assignments.docx
@@ -7,7 +7,7 @@
         <w:pStyle w:val="Heading1"/>
       </w:pPr>
       <w:r>
-        <w:t>Computer Information — Unit 1 Assignments</w:t>
+        <w:t>Unit 1 — Assignments: Introduction to Basic Computing</w:t>
       </w:r>
     </w:p>
     <w:p>
@@ -16,43 +16,28 @@
         <w:rPr>
           <w:b/>
         </w:rPr>
-        <w:t>Parul University</w:t>
+        <w:t>Course:</w:t>
       </w:r>
       <w:r>
-        <w:t xml:space="preserve"> · BA-LLB · </w:t>
+        <w:t xml:space="preserve"> Computer Information | </w:t>
       </w:r>
       <w:r>
         <w:rPr>
           <w:b/>
         </w:rPr>
-        <w:t>Computer Information</w:t>
+        <w:t>Hours:</w:t>
       </w:r>
       <w:r>
-        <w:t xml:space="preserve"> · </w:t>
+        <w:t xml:space="preserve"> 6 | </w:t>
       </w:r>
       <w:r>
         <w:rPr>
           <w:b/>
         </w:rPr>
-        <w:t>Prof. Shivam Bhakta</w:t>
+        <w:t>Objectives:</w:t>
       </w:r>
       <w:r>
-        <w:t xml:space="preserve">  </w:t>
-      </w:r>
-    </w:p>
-    <w:p>
-      <w:r>
-        <w:t xml:space="preserve">Aligned to Unit-1: Introduction to Basic Computing  </w:t>
-      </w:r>
-    </w:p>
-    <w:p>
-      <w:r>
-        <w:t>Use for CIA / continuous assessment practice.</w:t>
-      </w:r>
-    </w:p>
-    <w:p>
-      <w:r>
-        <w:t>---</w:t>
+        <w:t xml:space="preserve"> Obj 1, 2, 9</w:t>
       </w:r>
     </w:p>
     <w:p>
@@ -60,31 +45,52 @@
         <w:pStyle w:val="Heading2"/>
       </w:pPr>
       <w:r>
-        <w:t>Assignment 1 — Digital Chambers Starter Kit (Individual)</w:t>
+        <w:t>A1.1 — Computing Foundations Short Portfolio</w:t>
       </w:r>
     </w:p>
     <w:p>
+      <w:pPr>
+        <w:pStyle w:val="ListBullet"/>
+      </w:pPr>
       <w:r/>
       <w:r>
         <w:rPr>
           <w:b/>
         </w:rPr>
-        <w:t>Marks suggestion:</w:t>
+        <w:t>Type:</w:t>
       </w:r>
       <w:r>
-        <w:t xml:space="preserve"> 10  </w:t>
+        <w:t xml:space="preserve"> individual</w:t>
       </w:r>
     </w:p>
     <w:p>
+      <w:pPr>
+        <w:pStyle w:val="ListBullet"/>
+      </w:pPr>
       <w:r/>
       <w:r>
         <w:rPr>
           <w:b/>
         </w:rPr>
-        <w:t>Submission:</w:t>
+        <w:t>Time:</w:t>
       </w:r>
       <w:r>
-        <w:t xml:space="preserve"> PDF or DOCX  </w:t>
+        <w:t xml:space="preserve"> 3–4 hours</w:t>
+      </w:r>
+    </w:p>
+    <w:p>
+      <w:pPr>
+        <w:pStyle w:val="ListBullet"/>
+      </w:pPr>
+      <w:r/>
+      <w:r>
+        <w:rPr>
+          <w:b/>
+        </w:rPr>
+        <w:t>Objectives:</w:t>
+      </w:r>
+      <w:r>
+        <w:t xml:space="preserve"> Obj 1 [Understand], Obj 2 [Understand], Obj 9 [Apply]</w:t>
       </w:r>
     </w:p>
     <w:p>
@@ -92,12 +98,7 @@
         <w:pStyle w:val="Heading3"/>
       </w:pPr>
       <w:r>
-        <w:t>Task</w:t>
-      </w:r>
-    </w:p>
-    <w:p>
-      <w:r>
-        <w:t>Create a one-page “Digital Chambers Protocol” for a junior intern including:</w:t>
+        <w:t>Student prompt</w:t>
       </w:r>
     </w:p>
     <w:p>
@@ -105,7 +106,7 @@
         <w:pStyle w:val="ListBullet"/>
       </w:pPr>
       <w:r>
-        <w:t xml:space="preserve">Folder structure for one client matter (at least 5 folders).  </w:t>
+        <w:t>Draw/label the IPO + storage model and explain each part with a legal-work example (1 page).</w:t>
       </w:r>
     </w:p>
     <w:p>
@@ -113,7 +114,7 @@
         <w:pStyle w:val="ListBullet"/>
       </w:pPr>
       <w:r>
-        <w:t xml:space="preserve">File-naming rules (with 3 good examples and 3 bad examples).  </w:t>
+        <w:t>Create a professional folder structure for three fictional clients and document naming rules (½ page).</w:t>
       </w:r>
     </w:p>
     <w:p>
@@ -121,7 +122,7 @@
         <w:pStyle w:val="ListBullet"/>
       </w:pPr>
       <w:r>
-        <w:t xml:space="preserve">Daily backup rule (what + when + where).  </w:t>
+        <w:t>Write a 300-word note: “Applications of AI in the legal profession” (survey level; cite any class sources used).</w:t>
       </w:r>
     </w:p>
     <w:p>
@@ -129,15 +130,7 @@
         <w:pStyle w:val="ListBullet"/>
       </w:pPr>
       <w:r>
-        <w:t xml:space="preserve">Screen-lock / password hygiene rules.  </w:t>
-      </w:r>
-    </w:p>
-    <w:p>
-      <w:pPr>
-        <w:pStyle w:val="ListBullet"/>
-      </w:pPr>
-      <w:r>
-        <w:t>One paragraph on why these habits protect client confidentiality.</w:t>
+        <w:t>Submit a screenshot log of: creating folders, renaming a PDF judgment, and sending a professional practice email to your instructor (or draft email text if screenshots restricted).</w:t>
       </w:r>
     </w:p>
     <w:p>
@@ -145,17 +138,37 @@
         <w:pStyle w:val="Heading3"/>
       </w:pPr>
       <w:r>
-        <w:t>Evaluation focus</w:t>
+        <w:t>Rubric (25 marks)</w:t>
       </w:r>
     </w:p>
     <w:p>
       <w:r>
-        <w:t>Clarity, practicality, professional tone, and Unit-1 concept application.</w:t>
+        <w:t>Criterion | Excellent | Adequate | Needs work</w:t>
       </w:r>
     </w:p>
     <w:p>
       <w:r>
-        <w:t>---</w:t>
+        <w:t>IPO accuracy | Clear + legal examples | Mostly correct | Confused parts</w:t>
+      </w:r>
+    </w:p>
+    <w:p>
+      <w:r>
+        <w:t>File discipline | Clear structure + naming | Partial | Unusable</w:t>
+      </w:r>
+    </w:p>
+    <w:p>
+      <w:r>
+        <w:t>AI short note | Accurate survey | Thin | Incorrect</w:t>
+      </w:r>
+    </w:p>
+    <w:p>
+      <w:r>
+        <w:t>Practical evidence | Complete | Partial | Missing</w:t>
+      </w:r>
+    </w:p>
+    <w:p>
+      <w:r>
+        <w:t>Presentation | Neat, labeled | Readable | Careless</w:t>
       </w:r>
     </w:p>
     <w:p>
@@ -163,429 +176,12 @@
         <w:pStyle w:val="Heading2"/>
       </w:pPr>
       <w:r>
-        <w:t>Assignment 2 — Internet Research Mini Lab (Individual)</w:t>
-      </w:r>
-    </w:p>
-    <w:p>
-      <w:r/>
-      <w:r>
-        <w:rPr>
-          <w:b/>
-        </w:rPr>
-        <w:t>Marks suggestion:</w:t>
-      </w:r>
-      <w:r>
-        <w:t xml:space="preserve"> 10  </w:t>
-      </w:r>
-    </w:p>
-    <w:p>
-      <w:pPr>
-        <w:pStyle w:val="Heading3"/>
-      </w:pPr>
-      <w:r>
-        <w:t>Task</w:t>
+        <w:t>A1.2 — Digital Communication Mini-Brief</w:t>
       </w:r>
     </w:p>
     <w:p>
       <w:r>
-        <w:t>Using only authentic/official or clearly identified sources:</w:t>
-      </w:r>
-    </w:p>
-    <w:p>
-      <w:pPr>
-        <w:pStyle w:val="ListBullet"/>
-      </w:pPr>
-      <w:r>
-        <w:t xml:space="preserve">Find the official webpage of any one Indian court (Supreme Court / any High Court).  </w:t>
-      </w:r>
-    </w:p>
-    <w:p>
-      <w:pPr>
-        <w:pStyle w:val="ListBullet"/>
-      </w:pPr>
-      <w:r>
-        <w:t xml:space="preserve">Note the URL and what information is available (cause list / judgments / circulars).  </w:t>
-      </w:r>
-    </w:p>
-    <w:p>
-      <w:pPr>
-        <w:pStyle w:val="ListBullet"/>
-      </w:pPr>
-      <w:r>
-        <w:t xml:space="preserve">Write 150–200 words on how a BA-LLB student should evaluate whether an online legal source is reliable.  </w:t>
-      </w:r>
-    </w:p>
-    <w:p>
-      <w:pPr>
-        <w:pStyle w:val="ListBullet"/>
-      </w:pPr>
-      <w:r>
-        <w:t>Attach screenshots (optional) with date of access.</w:t>
-      </w:r>
-    </w:p>
-    <w:p>
-      <w:pPr>
-        <w:pStyle w:val="Heading3"/>
-      </w:pPr>
-      <w:r>
-        <w:t>Caution</w:t>
-      </w:r>
-    </w:p>
-    <w:p>
-      <w:r>
-        <w:t>Do not scrape or download copyrighted databases unlawfully. Use publicly accessible official pages.</w:t>
-      </w:r>
-    </w:p>
-    <w:p>
-      <w:r>
-        <w:t>---</w:t>
-      </w:r>
-    </w:p>
-    <w:p>
-      <w:pPr>
-        <w:pStyle w:val="Heading2"/>
-      </w:pPr>
-      <w:r>
-        <w:t>Assignment 3 — Digital Communication Role-Play (Pair Work)</w:t>
-      </w:r>
-    </w:p>
-    <w:p>
-      <w:r/>
-      <w:r>
-        <w:rPr>
-          <w:b/>
-        </w:rPr>
-        <w:t>Marks suggestion:</w:t>
-      </w:r>
-      <w:r>
-        <w:t xml:space="preserve"> 10  </w:t>
-      </w:r>
-    </w:p>
-    <w:p>
-      <w:pPr>
-        <w:pStyle w:val="Heading3"/>
-      </w:pPr>
-      <w:r>
-        <w:t>Scenario</w:t>
-      </w:r>
-    </w:p>
-    <w:p>
-      <w:r>
-        <w:t>A client asks by WhatsApp: “Can we win this case tomorrow? Reply fast.”</w:t>
-      </w:r>
-    </w:p>
-    <w:p>
-      <w:pPr>
-        <w:pStyle w:val="Heading3"/>
-      </w:pPr>
-      <w:r>
-        <w:t>Task</w:t>
-      </w:r>
-    </w:p>
-    <w:p>
-      <w:pPr>
-        <w:pStyle w:val="ListBullet"/>
-      </w:pPr>
-      <w:r>
-        <w:t xml:space="preserve">Student A writes an </w:t>
-      </w:r>
-      <w:r>
-        <w:rPr>
-          <w:b/>
-        </w:rPr>
-        <w:t>unprofessional</w:t>
-      </w:r>
-      <w:r>
-        <w:t xml:space="preserve"> reply (what not to do).  </w:t>
-      </w:r>
-    </w:p>
-    <w:p>
-      <w:pPr>
-        <w:pStyle w:val="ListBullet"/>
-      </w:pPr>
-      <w:r>
-        <w:t xml:space="preserve">Student B writes a </w:t>
-      </w:r>
-      <w:r>
-        <w:rPr>
-          <w:b/>
-        </w:rPr>
-        <w:t>professional</w:t>
-      </w:r>
-      <w:r>
-        <w:t xml:space="preserve"> reply (tone, caution, next steps, no overpromise).  </w:t>
-      </w:r>
-    </w:p>
-    <w:p>
-      <w:pPr>
-        <w:pStyle w:val="ListBullet"/>
-      </w:pPr>
-      <w:r>
-        <w:t>Together, submit a 1-page reflection:</w:t>
-      </w:r>
-    </w:p>
-    <w:p>
-      <w:r>
-        <w:t xml:space="preserve">   - Risks of casual legal promises on chat  </w:t>
-      </w:r>
-    </w:p>
-    <w:p>
-      <w:r>
-        <w:t xml:space="preserve">   - When to shift from WhatsApp to email  </w:t>
-      </w:r>
-    </w:p>
-    <w:p>
-      <w:r>
-        <w:t xml:space="preserve">   - What records should be kept</w:t>
-      </w:r>
-    </w:p>
-    <w:p>
-      <w:r>
-        <w:t>---</w:t>
-      </w:r>
-    </w:p>
-    <w:p>
-      <w:pPr>
-        <w:pStyle w:val="Heading2"/>
-      </w:pPr>
-      <w:r>
-        <w:t>Assignment 4 — AI Assisted, Human Verified (Individual)</w:t>
-      </w:r>
-    </w:p>
-    <w:p>
-      <w:r/>
-      <w:r>
-        <w:rPr>
-          <w:b/>
-        </w:rPr>
-        <w:t>Marks suggestion:</w:t>
-      </w:r>
-      <w:r>
-        <w:t xml:space="preserve"> 15  </w:t>
-      </w:r>
-    </w:p>
-    <w:p>
-      <w:pPr>
-        <w:pStyle w:val="Heading3"/>
-      </w:pPr>
-      <w:r>
-        <w:t>Task</w:t>
-      </w:r>
-    </w:p>
-    <w:p>
-      <w:pPr>
-        <w:pStyle w:val="ListBullet"/>
-      </w:pPr>
-      <w:r>
-        <w:t xml:space="preserve">Choose any one Unit-1 topic (e.g., OS / Internet / AI in law).  </w:t>
-      </w:r>
-    </w:p>
-    <w:p>
-      <w:pPr>
-        <w:pStyle w:val="ListBullet"/>
-      </w:pPr>
-      <w:r>
-        <w:t xml:space="preserve">Ask any AI tool to generate a 150-word explanation.  </w:t>
-      </w:r>
-    </w:p>
-    <w:p>
-      <w:pPr>
-        <w:pStyle w:val="ListBullet"/>
-      </w:pPr>
-      <w:r>
-        <w:t xml:space="preserve">Paste the AI output.  </w:t>
-      </w:r>
-    </w:p>
-    <w:p>
-      <w:pPr>
-        <w:pStyle w:val="ListBullet"/>
-      </w:pPr>
-      <w:r>
-        <w:t xml:space="preserve">Rewrite a corrected student version.  </w:t>
-      </w:r>
-    </w:p>
-    <w:p>
-      <w:pPr>
-        <w:pStyle w:val="ListBullet"/>
-      </w:pPr>
-      <w:r>
-        <w:t>Add a table:</w:t>
-      </w:r>
-    </w:p>
-    <w:p>
-      <w:r>
-        <w:t>AI Claim / Sentence | Verified? (Yes/No/Partial) | Your Correction / Comment</w:t>
-      </w:r>
-    </w:p>
-    <w:p>
-      <w:r>
-        <w:t xml:space="preserve"> |  | </w:t>
-      </w:r>
-    </w:p>
-    <w:p>
-      <w:pPr>
-        <w:pStyle w:val="ListBullet"/>
-      </w:pPr>
-      <w:r>
-        <w:t>Final reflection (100 words): benefits + risks (hallucination, bias, confidentiality).</w:t>
-      </w:r>
-    </w:p>
-    <w:p>
-      <w:pPr>
-        <w:pStyle w:val="Heading3"/>
-      </w:pPr>
-      <w:r>
-        <w:t>Learning outcome</w:t>
-      </w:r>
-    </w:p>
-    <w:p>
-      <w:r>
-        <w:t>Students practice Unit-5 ethics early: AI is assistant, not authority.</w:t>
-      </w:r>
-    </w:p>
-    <w:p>
-      <w:r>
-        <w:t>---</w:t>
-      </w:r>
-    </w:p>
-    <w:p>
-      <w:pPr>
-        <w:pStyle w:val="Heading2"/>
-      </w:pPr>
-      <w:r>
-        <w:t>Assignment 5 — Oral Presentation Seed (Optional for Seminar/CIA)</w:t>
-      </w:r>
-    </w:p>
-    <w:p>
-      <w:r/>
-      <w:r>
-        <w:rPr>
-          <w:b/>
-        </w:rPr>
-        <w:t>Marks suggestion:</w:t>
-      </w:r>
-      <w:r>
-        <w:t xml:space="preserve"> 10  </w:t>
-      </w:r>
-    </w:p>
-    <w:p>
-      <w:r>
-        <w:t xml:space="preserve">Prepare a 3-minute talk:  </w:t>
-      </w:r>
-    </w:p>
-    <w:p>
-      <w:r/>
-      <w:r>
-        <w:rPr>
-          <w:b/>
-        </w:rPr>
-        <w:t>“What a first-year law student must know about computers before internship.”</w:t>
-      </w:r>
-      <w:r/>
-    </w:p>
-    <w:p>
-      <w:r>
-        <w:t>Must include:</w:t>
-      </w:r>
-    </w:p>
-    <w:p>
-      <w:pPr>
-        <w:pStyle w:val="ListBullet"/>
-      </w:pPr>
-      <w:r>
-        <w:t xml:space="preserve">1 hardware example  </w:t>
-      </w:r>
-    </w:p>
-    <w:p>
-      <w:pPr>
-        <w:pStyle w:val="ListBullet"/>
-      </w:pPr>
-      <w:r>
-        <w:t xml:space="preserve">1 OS/file habit  </w:t>
-      </w:r>
-    </w:p>
-    <w:p>
-      <w:pPr>
-        <w:pStyle w:val="ListBullet"/>
-      </w:pPr>
-      <w:r>
-        <w:t xml:space="preserve">1 internet research caution  </w:t>
-      </w:r>
-    </w:p>
-    <w:p>
-      <w:pPr>
-        <w:pStyle w:val="ListBullet"/>
-      </w:pPr>
-      <w:r>
-        <w:t xml:space="preserve">1 AI caution  </w:t>
-      </w:r>
-    </w:p>
-    <w:p>
-      <w:r>
-        <w:t>(Slides for this can later be developed on the slides branch.)</w:t>
-      </w:r>
-    </w:p>
-    <w:p>
-      <w:r>
-        <w:t>---</w:t>
-      </w:r>
-    </w:p>
-    <w:p>
-      <w:pPr>
-        <w:pStyle w:val="Heading2"/>
-      </w:pPr>
-      <w:r>
-        <w:t>Submission Checklist</w:t>
-      </w:r>
-    </w:p>
-    <w:p>
-      <w:pPr>
-        <w:pStyle w:val="ListBullet"/>
-      </w:pPr>
-      <w:r>
-        <w:t xml:space="preserve">[ ] Name, enrolment no., semester on first page  </w:t>
-      </w:r>
-    </w:p>
-    <w:p>
-      <w:pPr>
-        <w:pStyle w:val="ListBullet"/>
-      </w:pPr>
-      <w:r>
-        <w:t xml:space="preserve">[ ] Unit number and assignment number in title  </w:t>
-      </w:r>
-    </w:p>
-    <w:p>
-      <w:pPr>
-        <w:pStyle w:val="ListBullet"/>
-      </w:pPr>
-      <w:r>
-        <w:t xml:space="preserve">[ ] Original writing (no blind copy-paste)  </w:t>
-      </w:r>
-    </w:p>
-    <w:p>
-      <w:pPr>
-        <w:pStyle w:val="ListBullet"/>
-      </w:pPr>
-      <w:r>
-        <w:t xml:space="preserve">[ ] If AI used, disclosure included as required by Assignment 4  </w:t>
-      </w:r>
-    </w:p>
-    <w:p>
-      <w:pPr>
-        <w:pStyle w:val="ListBullet"/>
-      </w:pPr>
-      <w:r>
-        <w:t>[ ] File named: RollNo_Unit1_AssignmentNo_Name.docx</w:t>
-      </w:r>
-    </w:p>
-    <w:p>
-      <w:r>
-        <w:t>---</w:t>
-      </w:r>
-    </w:p>
-    <w:p>
-      <w:r>
-        <w:t>Prof. Shivam Bhakta · Parul University · Computer Information</w:t>
+        <w:t>Draft a one-page professional email policy for a student legal clinic (subject lines, attachments, confidentiality, reply expectations).</w:t>
       </w:r>
     </w:p>
     <w:sectPr>

</xml_diff>